<commit_message>
docs: integracion de secciones del informe mensual en los entregables individuales
</commit_message>
<xml_diff>
--- a/05-Mayo-Junio/Entregables/2026-06/01-Reporte_Especificaciones_Vida_Saludable_2026-06_INSTITUCIONAL.docx
+++ b/05-Mayo-Junio/Entregables/2026-06/01-Reporte_Especificaciones_Vida_Saludable_2026-06_INSTITUCIONAL.docx
@@ -134,7 +134,7 @@
         <w:rPr>
           <w:rFonts w:ascii="Calibri" w:eastAsia="Times New Roman" w:hAnsi="Calibri" w:cs="Calibri"/>
         </w:rPr>
-        <w:pict w14:anchorId="597A8420">
+        <w:pict w14:anchorId="0D5E9FE6">
           <v:rect id="_x0000_i1025" style="width:0;height:1.5pt" o:hralign="center" o:hrstd="t" o:hr="t" fillcolor="#a0a0a0" stroked="f"/>
         </w:pict>
       </w:r>
@@ -247,7 +247,7 @@
         <w:rPr>
           <w:rFonts w:ascii="Calibri" w:eastAsia="Times New Roman" w:hAnsi="Calibri" w:cs="Calibri"/>
         </w:rPr>
-        <w:pict w14:anchorId="4C2BB03E">
+        <w:pict w14:anchorId="0228FD05">
           <v:rect id="_x0000_i1026" style="width:0;height:1.5pt" o:hralign="center" o:hrstd="t" o:hr="t" fillcolor="#a0a0a0" stroked="f"/>
         </w:pict>
       </w:r>
@@ -500,7 +500,7 @@
           <w:noProof/>
         </w:rPr>
         <w:drawing>
-          <wp:inline distT="0" distB="0" distL="0" distR="0" wp14:anchorId="0B1166BC" wp14:editId="359EED66">
+          <wp:inline distT="0" distB="0" distL="0" distR="0" wp14:anchorId="62F6EB3D" wp14:editId="35AB701B">
             <wp:extent cx="7741920" cy="15910560"/>
             <wp:effectExtent l="0" t="0" r="0" b="0"/>
             <wp:docPr id="3" name="Imagen 3"/>
@@ -559,7 +559,7 @@
         <w:rPr>
           <w:rFonts w:ascii="Calibri" w:eastAsia="Times New Roman" w:hAnsi="Calibri" w:cs="Calibri"/>
         </w:rPr>
-        <w:pict w14:anchorId="43151496">
+        <w:pict w14:anchorId="797F60B6">
           <v:rect id="_x0000_i1027" style="width:0;height:1.5pt" o:hralign="center" o:hrstd="t" o:hr="t" fillcolor="#a0a0a0" stroked="f"/>
         </w:pict>
       </w:r>
@@ -1265,7 +1265,7 @@
         <w:rPr>
           <w:rFonts w:ascii="Calibri" w:eastAsia="Times New Roman" w:hAnsi="Calibri" w:cs="Calibri"/>
         </w:rPr>
-        <w:pict w14:anchorId="1AC3A512">
+        <w:pict w14:anchorId="26AE134B">
           <v:rect id="_x0000_i1028" style="width:0;height:1.5pt" o:hralign="center" o:hrstd="t" o:hr="t" fillcolor="#a0a0a0" stroked="f"/>
         </w:pict>
       </w:r>
@@ -1691,7 +1691,7 @@
         <w:rPr>
           <w:rFonts w:ascii="Calibri" w:eastAsia="Times New Roman" w:hAnsi="Calibri" w:cs="Calibri"/>
         </w:rPr>
-        <w:pict w14:anchorId="5EA07090">
+        <w:pict w14:anchorId="7F26E14F">
           <v:rect id="_x0000_i1029" style="width:0;height:1.5pt" o:hralign="center" o:hrstd="t" o:hr="t" fillcolor="#a0a0a0" stroked="f"/>
         </w:pict>
       </w:r>
@@ -1982,6 +1982,108 @@
           <w:szCs w:val="22"/>
         </w:rPr>
         <w:t>Con esta declaratoria final, se hace oficial la conclusión operativa y el traspaso exitoso de responsabilidades sobre el ecosistema Vida Saludable (Fase 2).</w:t>
+      </w:r>
+    </w:p>
+    <w:p>
+      <w:pPr>
+        <w:pStyle w:val="Ttulo2"/>
+        <w:rPr>
+          <w:rFonts w:ascii="Calibri" w:eastAsia="Times New Roman" w:hAnsi="Calibri" w:cs="Calibri"/>
+        </w:rPr>
+      </w:pPr>
+      <w:r>
+        <w:rPr>
+          <w:rFonts w:ascii="Calibri" w:eastAsia="Times New Roman" w:hAnsi="Calibri" w:cs="Calibri"/>
+        </w:rPr>
+        <w:t>Actualización Especial de Cierre (Junio 2026)</w:t>
+      </w:r>
+    </w:p>
+    <w:p>
+      <w:pPr>
+        <w:pStyle w:val="Ttulo3"/>
+        <w:rPr>
+          <w:rFonts w:ascii="Calibri" w:eastAsia="Times New Roman" w:hAnsi="Calibri" w:cs="Calibri"/>
+        </w:rPr>
+      </w:pPr>
+      <w:r>
+        <w:rPr>
+          <w:rFonts w:ascii="Calibri" w:eastAsia="Times New Roman" w:hAnsi="Calibri" w:cs="Calibri"/>
+        </w:rPr>
+        <w:t>3.1 Blindaje de Criptografía e Inyecciones SQL (Vida Saludable)</w:t>
+      </w:r>
+    </w:p>
+    <w:p>
+      <w:pPr>
+        <w:numPr>
+          <w:ilvl w:val="0"/>
+          <w:numId w:val="17"/>
+        </w:numPr>
+        <w:spacing w:before="100" w:beforeAutospacing="1" w:after="100" w:afterAutospacing="1" w:line="240" w:lineRule="auto"/>
+        <w:rPr>
+          <w:rFonts w:ascii="Calibri" w:eastAsia="Times New Roman" w:hAnsi="Calibri" w:cs="Calibri"/>
+        </w:rPr>
+      </w:pPr>
+      <w:r>
+        <w:rPr>
+          <w:rStyle w:val="Fuerte"/>
+          <w:rFonts w:ascii="Calibri" w:eastAsia="Times New Roman" w:hAnsi="Calibri" w:cs="Calibri"/>
+        </w:rPr>
+        <w:t>Mitigación Issue 60 (Transición AES-256-GCM):</w:t>
+      </w:r>
+      <w:r>
+        <w:rPr>
+          <w:rFonts w:ascii="Calibri" w:eastAsia="Times New Roman" w:hAnsi="Calibri" w:cs="Calibri"/>
+        </w:rPr>
+        <w:t xml:space="preserve"> Se descubrió que la interacción histórica con los Web Services del IMSS utilizaba un estándar inseguro (AES-ECB) propenso a análisis criptográfico de patrones. En junio, se finalizó la migración hacia AES-256 en modo GCM (Galois/Counter Mode), proveyendo adicionalmente validación de integridad para prevenir manipulación del *token* en tránsito.</w:t>
+      </w:r>
+    </w:p>
+    <w:p>
+      <w:pPr>
+        <w:numPr>
+          <w:ilvl w:val="0"/>
+          <w:numId w:val="17"/>
+        </w:numPr>
+        <w:spacing w:before="100" w:beforeAutospacing="1" w:after="100" w:afterAutospacing="1" w:line="240" w:lineRule="auto"/>
+        <w:rPr>
+          <w:rFonts w:ascii="Calibri" w:eastAsia="Times New Roman" w:hAnsi="Calibri" w:cs="Calibri"/>
+        </w:rPr>
+      </w:pPr>
+      <w:r>
+        <w:rPr>
+          <w:rStyle w:val="Fuerte"/>
+          <w:rFonts w:ascii="Calibri" w:eastAsia="Times New Roman" w:hAnsi="Calibri" w:cs="Calibri"/>
+        </w:rPr>
+        <w:t>Remediación Issue 61 (SQL Injection Zero-Tolerance):</w:t>
+      </w:r>
+      <w:r>
+        <w:rPr>
+          <w:rFonts w:ascii="Calibri" w:eastAsia="Times New Roman" w:hAnsi="Calibri" w:cs="Calibri"/>
+        </w:rPr>
+        <w:t xml:space="preserve"> Se erradicó por completo la construcción dinámica de filtros (f-strings) en la capa de persistencia </w:t>
+      </w:r>
+      <w:r>
+        <w:rPr>
+          <w:rStyle w:val="CdigoHTML"/>
+        </w:rPr>
+        <w:t>pg8000</w:t>
+      </w:r>
+      <w:r>
+        <w:rPr>
+          <w:rFonts w:ascii="Calibri" w:eastAsia="Times New Roman" w:hAnsi="Calibri" w:cs="Calibri"/>
+        </w:rPr>
+        <w:t xml:space="preserve">, parametrizando todas y cada una de las *queries*, blindando la lectura de la tabla </w:t>
+      </w:r>
+      <w:r>
+        <w:rPr>
+          <w:rStyle w:val="CdigoHTML"/>
+        </w:rPr>
+        <w:t>menor_evaluado</w:t>
+      </w:r>
+      <w:r>
+        <w:rPr>
+          <w:rFonts w:ascii="Calibri" w:eastAsia="Times New Roman" w:hAnsi="Calibri" w:cs="Calibri"/>
+        </w:rPr>
+        <w:t xml:space="preserve"> y del historial de lotes contra intentos de inyección estructurada.</w:t>
       </w:r>
     </w:p>
     <w:p>
@@ -3292,9 +3394,9 @@
     </w:lvl>
   </w:abstractNum>
   <w:abstractNum w:abstractNumId="9" w15:restartNumberingAfterBreak="0">
-    <w:nsid w:val="281B4B0C"/>
+    <w:nsid w:val="1EF71524"/>
     <w:multiLevelType w:val="multilevel"/>
-    <w:tmpl w:val="7A52362A"/>
+    <w:tmpl w:val="AFD4F176"/>
     <w:lvl w:ilvl="0">
       <w:start w:val="1"/>
       <w:numFmt w:val="bullet"/>
@@ -3441,6 +3543,155 @@
     </w:lvl>
   </w:abstractNum>
   <w:abstractNum w:abstractNumId="10" w15:restartNumberingAfterBreak="0">
+    <w:nsid w:val="211C70C3"/>
+    <w:multiLevelType w:val="multilevel"/>
+    <w:tmpl w:val="825C77B4"/>
+    <w:lvl w:ilvl="0">
+      <w:start w:val="1"/>
+      <w:numFmt w:val="bullet"/>
+      <w:lvlText w:val=""/>
+      <w:lvlJc w:val="left"/>
+      <w:pPr>
+        <w:tabs>
+          <w:tab w:val="num" w:pos="720"/>
+        </w:tabs>
+        <w:ind w:left="720" w:hanging="360"/>
+      </w:pPr>
+      <w:rPr>
+        <w:rFonts w:ascii="Symbol" w:hAnsi="Symbol" w:hint="default"/>
+        <w:sz w:val="20"/>
+      </w:rPr>
+    </w:lvl>
+    <w:lvl w:ilvl="1" w:tentative="1">
+      <w:start w:val="1"/>
+      <w:numFmt w:val="bullet"/>
+      <w:lvlText w:val="o"/>
+      <w:lvlJc w:val="left"/>
+      <w:pPr>
+        <w:tabs>
+          <w:tab w:val="num" w:pos="1440"/>
+        </w:tabs>
+        <w:ind w:left="1440" w:hanging="360"/>
+      </w:pPr>
+      <w:rPr>
+        <w:rFonts w:ascii="Courier New" w:hAnsi="Courier New" w:hint="default"/>
+        <w:sz w:val="20"/>
+      </w:rPr>
+    </w:lvl>
+    <w:lvl w:ilvl="2" w:tentative="1">
+      <w:start w:val="1"/>
+      <w:numFmt w:val="bullet"/>
+      <w:lvlText w:val=""/>
+      <w:lvlJc w:val="left"/>
+      <w:pPr>
+        <w:tabs>
+          <w:tab w:val="num" w:pos="2160"/>
+        </w:tabs>
+        <w:ind w:left="2160" w:hanging="360"/>
+      </w:pPr>
+      <w:rPr>
+        <w:rFonts w:ascii="Wingdings" w:hAnsi="Wingdings" w:hint="default"/>
+        <w:sz w:val="20"/>
+      </w:rPr>
+    </w:lvl>
+    <w:lvl w:ilvl="3" w:tentative="1">
+      <w:start w:val="1"/>
+      <w:numFmt w:val="bullet"/>
+      <w:lvlText w:val=""/>
+      <w:lvlJc w:val="left"/>
+      <w:pPr>
+        <w:tabs>
+          <w:tab w:val="num" w:pos="2880"/>
+        </w:tabs>
+        <w:ind w:left="2880" w:hanging="360"/>
+      </w:pPr>
+      <w:rPr>
+        <w:rFonts w:ascii="Wingdings" w:hAnsi="Wingdings" w:hint="default"/>
+        <w:sz w:val="20"/>
+      </w:rPr>
+    </w:lvl>
+    <w:lvl w:ilvl="4" w:tentative="1">
+      <w:start w:val="1"/>
+      <w:numFmt w:val="bullet"/>
+      <w:lvlText w:val=""/>
+      <w:lvlJc w:val="left"/>
+      <w:pPr>
+        <w:tabs>
+          <w:tab w:val="num" w:pos="3600"/>
+        </w:tabs>
+        <w:ind w:left="3600" w:hanging="360"/>
+      </w:pPr>
+      <w:rPr>
+        <w:rFonts w:ascii="Wingdings" w:hAnsi="Wingdings" w:hint="default"/>
+        <w:sz w:val="20"/>
+      </w:rPr>
+    </w:lvl>
+    <w:lvl w:ilvl="5" w:tentative="1">
+      <w:start w:val="1"/>
+      <w:numFmt w:val="bullet"/>
+      <w:lvlText w:val=""/>
+      <w:lvlJc w:val="left"/>
+      <w:pPr>
+        <w:tabs>
+          <w:tab w:val="num" w:pos="4320"/>
+        </w:tabs>
+        <w:ind w:left="4320" w:hanging="360"/>
+      </w:pPr>
+      <w:rPr>
+        <w:rFonts w:ascii="Wingdings" w:hAnsi="Wingdings" w:hint="default"/>
+        <w:sz w:val="20"/>
+      </w:rPr>
+    </w:lvl>
+    <w:lvl w:ilvl="6" w:tentative="1">
+      <w:start w:val="1"/>
+      <w:numFmt w:val="bullet"/>
+      <w:lvlText w:val=""/>
+      <w:lvlJc w:val="left"/>
+      <w:pPr>
+        <w:tabs>
+          <w:tab w:val="num" w:pos="5040"/>
+        </w:tabs>
+        <w:ind w:left="5040" w:hanging="360"/>
+      </w:pPr>
+      <w:rPr>
+        <w:rFonts w:ascii="Wingdings" w:hAnsi="Wingdings" w:hint="default"/>
+        <w:sz w:val="20"/>
+      </w:rPr>
+    </w:lvl>
+    <w:lvl w:ilvl="7" w:tentative="1">
+      <w:start w:val="1"/>
+      <w:numFmt w:val="bullet"/>
+      <w:lvlText w:val=""/>
+      <w:lvlJc w:val="left"/>
+      <w:pPr>
+        <w:tabs>
+          <w:tab w:val="num" w:pos="5760"/>
+        </w:tabs>
+        <w:ind w:left="5760" w:hanging="360"/>
+      </w:pPr>
+      <w:rPr>
+        <w:rFonts w:ascii="Wingdings" w:hAnsi="Wingdings" w:hint="default"/>
+        <w:sz w:val="20"/>
+      </w:rPr>
+    </w:lvl>
+    <w:lvl w:ilvl="8" w:tentative="1">
+      <w:start w:val="1"/>
+      <w:numFmt w:val="bullet"/>
+      <w:lvlText w:val=""/>
+      <w:lvlJc w:val="left"/>
+      <w:pPr>
+        <w:tabs>
+          <w:tab w:val="num" w:pos="6480"/>
+        </w:tabs>
+        <w:ind w:left="6480" w:hanging="360"/>
+      </w:pPr>
+      <w:rPr>
+        <w:rFonts w:ascii="Wingdings" w:hAnsi="Wingdings" w:hint="default"/>
+        <w:sz w:val="20"/>
+      </w:rPr>
+    </w:lvl>
+  </w:abstractNum>
+  <w:abstractNum w:abstractNumId="11" w15:restartNumberingAfterBreak="0">
     <w:nsid w:val="28FF771F"/>
     <w:multiLevelType w:val="hybridMultilevel"/>
     <w:tmpl w:val="660C7888"/>
@@ -3553,7 +3804,7 @@
       </w:rPr>
     </w:lvl>
   </w:abstractNum>
-  <w:abstractNum w:abstractNumId="11" w15:restartNumberingAfterBreak="0">
+  <w:abstractNum w:abstractNumId="12" w15:restartNumberingAfterBreak="0">
     <w:nsid w:val="52D74056"/>
     <w:multiLevelType w:val="hybridMultilevel"/>
     <w:tmpl w:val="F8E884D6"/>
@@ -3642,7 +3893,7 @@
       </w:pPr>
     </w:lvl>
   </w:abstractNum>
-  <w:abstractNum w:abstractNumId="12" w15:restartNumberingAfterBreak="0">
+  <w:abstractNum w:abstractNumId="13" w15:restartNumberingAfterBreak="0">
     <w:nsid w:val="53C20551"/>
     <w:multiLevelType w:val="hybridMultilevel"/>
     <w:tmpl w:val="9EBC212E"/>
@@ -3731,10 +3982,10 @@
       </w:pPr>
     </w:lvl>
   </w:abstractNum>
-  <w:abstractNum w:abstractNumId="13" w15:restartNumberingAfterBreak="0">
-    <w:nsid w:val="6C653D3D"/>
+  <w:abstractNum w:abstractNumId="14" w15:restartNumberingAfterBreak="0">
+    <w:nsid w:val="59264DAC"/>
     <w:multiLevelType w:val="multilevel"/>
-    <w:tmpl w:val="BCD61580"/>
+    <w:tmpl w:val="FFE6BF20"/>
     <w:lvl w:ilvl="0">
       <w:start w:val="1"/>
       <w:numFmt w:val="bullet"/>
@@ -3880,10 +4131,10 @@
       </w:rPr>
     </w:lvl>
   </w:abstractNum>
-  <w:abstractNum w:abstractNumId="14" w15:restartNumberingAfterBreak="0">
-    <w:nsid w:val="71CB4628"/>
+  <w:abstractNum w:abstractNumId="15" w15:restartNumberingAfterBreak="0">
+    <w:nsid w:val="5DFE15CE"/>
     <w:multiLevelType w:val="multilevel"/>
-    <w:tmpl w:val="3B8E2C96"/>
+    <w:tmpl w:val="5826330A"/>
     <w:lvl w:ilvl="0">
       <w:start w:val="1"/>
       <w:numFmt w:val="bullet"/>
@@ -4029,10 +4280,10 @@
       </w:rPr>
     </w:lvl>
   </w:abstractNum>
-  <w:abstractNum w:abstractNumId="15" w15:restartNumberingAfterBreak="0">
-    <w:nsid w:val="796974B8"/>
+  <w:abstractNum w:abstractNumId="16" w15:restartNumberingAfterBreak="0">
+    <w:nsid w:val="6F9E3D42"/>
     <w:multiLevelType w:val="multilevel"/>
-    <w:tmpl w:val="2EBE82C8"/>
+    <w:tmpl w:val="B6B018E8"/>
     <w:lvl w:ilvl="0">
       <w:start w:val="1"/>
       <w:numFmt w:val="bullet"/>
@@ -4197,7 +4448,7 @@
     <w:abstractNumId w:val="0"/>
   </w:num>
   <w:num w:numId="7" w16cid:durableId="767509364">
-    <w:abstractNumId w:val="11"/>
+    <w:abstractNumId w:val="12"/>
   </w:num>
   <w:num w:numId="8" w16cid:durableId="1187519976">
     <w:abstractNumId w:val="8"/>
@@ -4206,25 +4457,28 @@
     <w:abstractNumId w:val="7"/>
   </w:num>
   <w:num w:numId="10" w16cid:durableId="2009867063">
-    <w:abstractNumId w:val="10"/>
+    <w:abstractNumId w:val="11"/>
   </w:num>
   <w:num w:numId="11" w16cid:durableId="1924602666">
-    <w:abstractNumId w:val="12"/>
+    <w:abstractNumId w:val="13"/>
   </w:num>
   <w:num w:numId="12" w16cid:durableId="2021344936">
     <w:abstractNumId w:val="2"/>
   </w:num>
-  <w:num w:numId="13" w16cid:durableId="445464221">
-    <w:abstractNumId w:val="13"/>
-  </w:num>
-  <w:num w:numId="14" w16cid:durableId="446772733">
+  <w:num w:numId="13" w16cid:durableId="1759907188">
     <w:abstractNumId w:val="9"/>
   </w:num>
-  <w:num w:numId="15" w16cid:durableId="1653751094">
+  <w:num w:numId="14" w16cid:durableId="1599823540">
+    <w:abstractNumId w:val="10"/>
+  </w:num>
+  <w:num w:numId="15" w16cid:durableId="984621320">
+    <w:abstractNumId w:val="15"/>
+  </w:num>
+  <w:num w:numId="16" w16cid:durableId="1597664432">
     <w:abstractNumId w:val="14"/>
   </w:num>
-  <w:num w:numId="16" w16cid:durableId="1453595237">
-    <w:abstractNumId w:val="15"/>
+  <w:num w:numId="17" w16cid:durableId="2103407061">
+    <w:abstractNumId w:val="16"/>
   </w:num>
   <w:numIdMacAtCleanup w:val="10"/>
 </w:numbering>
@@ -15844,7 +16098,7 @@
     <w:uiPriority w:val="99"/>
     <w:semiHidden/>
     <w:unhideWhenUsed/>
-    <w:rsid w:val="000C1ED1"/>
+    <w:rsid w:val="00842E84"/>
     <w:pPr>
       <w:spacing w:before="100" w:beforeAutospacing="1" w:after="100" w:afterAutospacing="1" w:line="240" w:lineRule="auto"/>
     </w:pPr>
@@ -15862,7 +16116,7 @@
     <w:uiPriority w:val="99"/>
     <w:semiHidden/>
     <w:unhideWhenUsed/>
-    <w:rsid w:val="000C1ED1"/>
+    <w:rsid w:val="00842E84"/>
     <w:rPr>
       <w:rFonts w:ascii="Courier New" w:eastAsiaTheme="minorEastAsia" w:hAnsi="Courier New" w:cs="Courier New"/>
       <w:sz w:val="20"/>

</xml_diff>